<commit_message>
Correccion de asingnacion de lecturas, lecturas y transcripcion
</commit_message>
<xml_diff>
--- a/public/reporte_lecturas/5887966-LOZANO LOPEZFARID IGNACIO.docx
+++ b/public/reporte_lecturas/5887966-LOZANO LOPEZFARID IGNACIO.docx
@@ -143,7 +143,7 @@
         <w:t xml:space="preserve">Fecha de Lectura: </w:t>
       </w:r>
       <w:r>
-        <w:t>21/06/2024 22:36</w:t>
+        <w:t>23/06/2024 13:40</w:t>
       </w:r>
     </w:p>
     <w:p>
@@ -413,7 +413,7 @@
         <w:t xml:space="preserve">   Atención: null
 Fecha y Hora: 2024-06-20 04:54:46
 RADIOGRAFIA DE ANTEBRAZO
-prueba</w:t>
+prueba 0004</w:t>
       </w:r>
     </w:p>
     <w:bookmarkEnd w:id="0"/>

</xml_diff>